<commit_message>
Replace header/footer in all docx files with school template
Applied new Al-Iman school header (with logo images) and footer
(page numbers) to all 74 .docx files. Preserves document body
content and adjusts margins for header/footer space.

Co-Authored-By: Claude Opus 4.6 <noreply@anthropic.com>
Claude-Session: https://claude.ai/code/session_017tEAoTM3ofSdc6PteZCeVk
</commit_message>
<xml_diff>
--- a/2026 الى 2027/التكليف 2026/الفصل الأول/تكليف الاختبارات للفصل الاول -كيمياء 2026.docx
+++ b/2026 الى 2027/التكليف 2026/الفصل الأول/تكليف الاختبارات للفصل الاول -كيمياء 2026.docx
@@ -2101,8 +2101,10 @@
       </w:r>
     </w:p>
     <w:sectPr>
+      <w:headerReference w:type="default" r:id="rId21"/>
+      <w:footerReference w:type="default" r:id="rId22"/>
       <w:pgSz w:w="15840" w:h="12240" w:orient="landscape"/>
-      <w:pgMar w:top="720" w:right="720" w:bottom="720" w:left="720" w:header="720" w:footer="720" w:gutter="0"/>
+      <w:pgMar w:top="1750" w:right="720" w:bottom="1750" w:left="720" w:header="500" w:footer="400" w:gutter="0"/>
       <w:cols w:space="720"/>
       <w:docGrid w:linePitch="360"/>
     </w:sectPr>
@@ -2135,6 +2137,181 @@
 </w:endnotes>
 </file>
 
+<file path=word/footer1.xml><?xml version="1.0" encoding="utf-8"?>
+<w:ftr xmlns:wpc="http://schemas.microsoft.com/office/word/2010/wordprocessingCanvas" xmlns:cx="http://schemas.microsoft.com/office/drawing/2014/chartex" xmlns:cx1="http://schemas.microsoft.com/office/drawing/2015/9/8/chartex" xmlns:cx2="http://schemas.microsoft.com/office/drawing/2015/10/21/chartex" xmlns:cx3="http://schemas.microsoft.com/office/drawing/2016/5/9/chartex" xmlns:cx4="http://schemas.microsoft.com/office/drawing/2016/5/10/chartex" xmlns:cx5="http://schemas.microsoft.com/office/drawing/2016/5/11/chartex" xmlns:cx6="http://schemas.microsoft.com/office/drawing/2016/5/12/chartex" xmlns:cx7="http://schemas.microsoft.com/office/drawing/2016/5/13/chartex" xmlns:cx8="http://schemas.microsoft.com/office/drawing/2016/5/14/chartex" xmlns:mc="http://schemas.openxmlformats.org/markup-compatibility/2006" xmlns:m="http://schemas.openxmlformats.org/officeDocument/2006/math" xmlns:aink="http://schemas.microsoft.com/office/drawing/2016/ink" xmlns:am3d="http://schemas.microsoft.com/office/drawing/2017/model3d" xmlns:oel="http://schemas.microsoft.com/office/2019/extlst" xmlns:r="http://schemas.openxmlformats.org/officeDocument/2006/relationships" xmlns:wp14="http://schemas.microsoft.com/office/word/2010/wordprocessingDrawing" xmlns:wp="http://schemas.openxmlformats.org/drawingml/2006/wordprocessingDrawing" xmlns:wpg="http://schemas.microsoft.com/office/word/2010/wordprocessingGroup" xmlns:wpi="http://schemas.microsoft.com/office/word/2010/wordprocessingInk" xmlns:wps="http://schemas.microsoft.com/office/word/2010/wordprocessingShape" xmlns:o="urn:schemas-microsoft-com:office:office" xmlns:v="urn:schemas-microsoft-com:vml" xmlns:w10="urn:schemas-microsoft-com:office:word" xmlns:w="http://schemas.openxmlformats.org/wordprocessingml/2006/main" xmlns:w14="http://schemas.microsoft.com/office/word/2010/wordml" xmlns:w15="http://schemas.microsoft.com/office/word/2012/wordml" xmlns:w16cex="http://schemas.microsoft.com/office/word/2018/wordml/cex" xmlns:w16cid="http://schemas.microsoft.com/office/word/2016/wordml/cid" xmlns:w16="http://schemas.microsoft.com/office/word/2018/wordml" xmlns:w16sdtdh="http://schemas.microsoft.com/office/word/2020/wordml/sdtdatahash" xmlns:w16sdtfl="http://schemas.microsoft.com/office/word/2024/wordml/sdtformatlock" xmlns:w16se="http://schemas.microsoft.com/office/word/2015/wordml/symex" xmlns:w16du="http://schemas.microsoft.com/office/word/2023/wordml/word16du" xmlns:wne="http://schemas.microsoft.com/office/word/2006/wordml" mc:Ignorable="w14 w15 w16se w16cid w16 w16cex w16sdtdh w16sdtfl w16du wp14">
+  <w:tbl>
+    <w:tblPr>
+      <w:tblW w:w="11290" w:type="dxa"/>
+      <w:tblInd w:w="-958" w:type="dxa"/>
+      <w:tblBorders>
+        <w:top w:val="none" w:sz="0" w:space="0" w:color="FFFFFF"/>
+        <w:left w:val="none" w:sz="0" w:space="0" w:color="FFFFFF"/>
+        <w:bottom w:val="none" w:sz="0" w:space="0" w:color="FFFFFF"/>
+        <w:right w:val="none" w:sz="0" w:space="0" w:color="FFFFFF"/>
+        <w:insideH w:val="none" w:sz="0" w:space="0" w:color="FFFFFF"/>
+        <w:insideV w:val="none" w:sz="0" w:space="0" w:color="FFFFFF"/>
+      </w:tblBorders>
+      <w:tblLayout w:type="fixed"/>
+      <w:tblCellMar>
+        <w:left w:w="10" w:type="dxa"/>
+        <w:right w:w="10" w:type="dxa"/>
+      </w:tblCellMar>
+      <w:tblLook w:val="04A0" w:firstRow="1" w:lastRow="0" w:firstColumn="1" w:lastColumn="0" w:noHBand="0" w:noVBand="1"/>
+    </w:tblPr>
+    <w:tblGrid>
+      <w:gridCol w:w="11290"/>
+    </w:tblGrid>
+    <w:tr>
+      <w:trPr>
+        <w:trHeight w:val="43"/>
+      </w:trPr>
+      <w:tc>
+        <w:tcPr>
+          <w:tcW w:w="11290" w:type="dxa"/>
+          <w:tcBorders>
+            <w:top w:val="none" w:sz="0" w:space="0" w:color="FFFFFF"/>
+            <w:left w:val="none" w:sz="0" w:space="0" w:color="FFFFFF"/>
+            <w:bottom w:val="none" w:sz="0" w:space="0" w:color="FFFFFF"/>
+            <w:right w:val="none" w:sz="0" w:space="0" w:color="FFFFFF"/>
+          </w:tcBorders>
+          <w:tcMar>
+            <w:top w:w="50" w:type="dxa"/>
+            <w:left w:w="0" w:type="dxa"/>
+            <w:bottom w:w="0" w:type="dxa"/>
+            <w:right w:w="0" w:type="dxa"/>
+          </w:tcMar>
+          <w:vAlign w:val="center"/>
+        </w:tcPr>
+        <w:p>
+          <w:pPr>
+            <w:spacing w:line="180" w:lineRule="exact"/>
+            <w:jc w:val="right"/>
+          </w:pPr>
+          <w:r>
+            <w:rPr>
+              <w:color w:val="4A4A4A"/>
+              <w:sz w:val="21"/>
+              <w:szCs w:val="21"/>
+            </w:rPr>
+            <w:t xml:space="preserve">Page </w:t>
+          </w:r>
+          <w:r>
+            <w:rPr>
+              <w:b/>
+              <w:bCs/>
+              <w:color w:val="C9A227"/>
+              <w:sz w:val="22"/>
+              <w:szCs w:val="22"/>
+            </w:rPr>
+            <w:fldChar w:fldCharType="begin"/>
+          </w:r>
+          <w:r>
+            <w:rPr>
+              <w:b/>
+              <w:bCs/>
+              <w:color w:val="C9A227"/>
+              <w:sz w:val="22"/>
+              <w:szCs w:val="22"/>
+            </w:rPr>
+            <w:instrText>PAGE</w:instrText>
+          </w:r>
+          <w:r>
+            <w:rPr>
+              <w:b/>
+              <w:bCs/>
+              <w:color w:val="C9A227"/>
+              <w:sz w:val="22"/>
+              <w:szCs w:val="22"/>
+            </w:rPr>
+            <w:fldChar w:fldCharType="separate"/>
+          </w:r>
+          <w:r>
+            <w:rPr>
+              <w:b/>
+              <w:bCs/>
+              <w:noProof/>
+              <w:color w:val="C9A227"/>
+              <w:sz w:val="22"/>
+              <w:szCs w:val="22"/>
+            </w:rPr>
+            <w:t>1</w:t>
+          </w:r>
+          <w:r>
+            <w:rPr>
+              <w:b/>
+              <w:bCs/>
+              <w:color w:val="C9A227"/>
+              <w:sz w:val="22"/>
+              <w:szCs w:val="22"/>
+            </w:rPr>
+            <w:fldChar w:fldCharType="end"/>
+          </w:r>
+          <w:r>
+            <w:rPr>
+              <w:color w:val="4A4A4A"/>
+              <w:sz w:val="21"/>
+              <w:szCs w:val="21"/>
+            </w:rPr>
+            <w:t xml:space="preserve"> / </w:t>
+          </w:r>
+          <w:r>
+            <w:rPr>
+              <w:b/>
+              <w:bCs/>
+              <w:color w:val="C9A227"/>
+              <w:sz w:val="22"/>
+              <w:szCs w:val="22"/>
+            </w:rPr>
+            <w:fldChar w:fldCharType="begin"/>
+          </w:r>
+          <w:r>
+            <w:rPr>
+              <w:b/>
+              <w:bCs/>
+              <w:color w:val="C9A227"/>
+              <w:sz w:val="22"/>
+              <w:szCs w:val="22"/>
+            </w:rPr>
+            <w:instrText>NUMPAGES</w:instrText>
+          </w:r>
+          <w:r>
+            <w:rPr>
+              <w:b/>
+              <w:bCs/>
+              <w:color w:val="C9A227"/>
+              <w:sz w:val="22"/>
+              <w:szCs w:val="22"/>
+            </w:rPr>
+            <w:fldChar w:fldCharType="separate"/>
+          </w:r>
+          <w:r>
+            <w:rPr>
+              <w:b/>
+              <w:bCs/>
+              <w:noProof/>
+              <w:color w:val="C9A227"/>
+              <w:sz w:val="22"/>
+              <w:szCs w:val="22"/>
+            </w:rPr>
+            <w:t>1</w:t>
+          </w:r>
+          <w:r>
+            <w:rPr>
+              <w:b/>
+              <w:bCs/>
+              <w:color w:val="C9A227"/>
+              <w:sz w:val="22"/>
+              <w:szCs w:val="22"/>
+            </w:rPr>
+            <w:fldChar w:fldCharType="end"/>
+          </w:r>
+        </w:p>
+      </w:tc>
+    </w:tr>
+  </w:tbl>
+</w:ftr>
+</file>
+
 <file path=word/footnotes.xml><?xml version="1.0" encoding="utf-8"?>
 <w:footnotes xmlns:wpc="http://schemas.microsoft.com/office/word/2026/wordprocessingCanvas" xmlns:cx="http://schemas.microsoft.com/office/drawing/2026/chartex" xmlns:cx1="http://schemas.microsoft.com/office/drawing/2026/9/8/chartex" xmlns:cx2="http://schemas.microsoft.com/office/drawing/2026/10/21/chartex" xmlns:cx3="http://schemas.microsoft.com/office/drawing/2026/5/9/chartex" xmlns:cx4="http://schemas.microsoft.com/office/drawing/2026/5/10/chartex" xmlns:cx5="http://schemas.microsoft.com/office/drawing/2026/5/11/chartex" xmlns:cx6="http://schemas.microsoft.com/office/drawing/2026/5/12/chartex" xmlns:cx7="http://schemas.microsoft.com/office/drawing/2026/5/13/chartex" xmlns:cx8="http://schemas.microsoft.com/office/drawing/2026/5/14/chartex" xmlns:mc="http://schemas.openxmlformats.org/markup-compatibility/2006" xmlns:aink="http://schemas.microsoft.com/office/drawing/2026/ink" xmlns:am3d="http://schemas.microsoft.com/office/drawing/2026/model3d" xmlns:o="urn:schemas-microsoft-com:office:office" xmlns:oel="http://schemas.microsoft.com/office/2026/extlst" xmlns:r="http://schemas.openxmlformats.org/officeDocument/2006/relationships" xmlns:m="http://schemas.openxmlformats.org/officeDocument/2006/math" xmlns:v="urn:schemas-microsoft-com:vml" xmlns:wp14="http://schemas.microsoft.com/office/word/2026/wordprocessingDrawing" xmlns:wp="http://schemas.openxmlformats.org/drawingml/2006/wordprocessingDrawing" xmlns:w10="urn:schemas-microsoft-com:office:word" xmlns:w="http://schemas.openxmlformats.org/wordprocessingml/2006/main" xmlns:w14="http://schemas.microsoft.com/office/word/2026/wordml" xmlns:w15="http://schemas.microsoft.com/office/word/2026/wordml" xmlns:w16cex="http://schemas.microsoft.com/office/word/2026/wordml/cex" xmlns:w16cid="http://schemas.microsoft.com/office/word/2026/wordml/cid" xmlns:w16="http://schemas.microsoft.com/office/word/2026/wordml" xmlns:w16du="http://schemas.microsoft.com/office/word/2026/wordml/word16du" xmlns:w16sdtdh="http://schemas.microsoft.com/office/word/2026/wordml/sdtdatahash" xmlns:w16sdtfl="http://schemas.microsoft.com/office/word/2026/wordml/sdtformatlock" xmlns:w16se="http://schemas.microsoft.com/office/word/2026/wordml/symex" xmlns:wpg="http://schemas.microsoft.com/office/word/2026/wordprocessingGroup" xmlns:wpi="http://schemas.microsoft.com/office/word/2026/wordprocessingInk" xmlns:wne="http://schemas.microsoft.com/office/word/2006/wordml" xmlns:wps="http://schemas.microsoft.com/office/word/2026/wordprocessingShape" mc:Ignorable="w14 w15 w16se w16cid w16 w16cex w16sdtdh w16sdtfl w16du wp14">
   <w:footnote w:type="separator" w:id="-1">
@@ -2158,6 +2335,295 @@
     </w:p>
   </w:footnote>
 </w:footnotes>
+</file>
+
+<file path=word/header1.xml><?xml version="1.0" encoding="utf-8"?>
+<w:hdr xmlns:wpc="http://schemas.microsoft.com/office/word/2010/wordprocessingCanvas" xmlns:cx="http://schemas.microsoft.com/office/drawing/2014/chartex" xmlns:cx1="http://schemas.microsoft.com/office/drawing/2015/9/8/chartex" xmlns:cx2="http://schemas.microsoft.com/office/drawing/2015/10/21/chartex" xmlns:cx3="http://schemas.microsoft.com/office/drawing/2016/5/9/chartex" xmlns:cx4="http://schemas.microsoft.com/office/drawing/2016/5/10/chartex" xmlns:cx5="http://schemas.microsoft.com/office/drawing/2016/5/11/chartex" xmlns:cx6="http://schemas.microsoft.com/office/drawing/2016/5/12/chartex" xmlns:cx7="http://schemas.microsoft.com/office/drawing/2016/5/13/chartex" xmlns:cx8="http://schemas.microsoft.com/office/drawing/2016/5/14/chartex" xmlns:mc="http://schemas.openxmlformats.org/markup-compatibility/2006" xmlns:m="http://schemas.openxmlformats.org/officeDocument/2006/math" xmlns:aink="http://schemas.microsoft.com/office/drawing/2016/ink" xmlns:am3d="http://schemas.microsoft.com/office/drawing/2017/model3d" xmlns:oel="http://schemas.microsoft.com/office/2019/extlst" xmlns:r="http://schemas.openxmlformats.org/officeDocument/2006/relationships" xmlns:wp14="http://schemas.microsoft.com/office/word/2010/wordprocessingDrawing" xmlns:wp="http://schemas.openxmlformats.org/drawingml/2006/wordprocessingDrawing" xmlns:wpg="http://schemas.microsoft.com/office/word/2010/wordprocessingGroup" xmlns:wpi="http://schemas.microsoft.com/office/word/2010/wordprocessingInk" xmlns:wps="http://schemas.microsoft.com/office/word/2010/wordprocessingShape" xmlns:o="urn:schemas-microsoft-com:office:office" xmlns:v="urn:schemas-microsoft-com:vml" xmlns:w10="urn:schemas-microsoft-com:office:word" xmlns:w="http://schemas.openxmlformats.org/wordprocessingml/2006/main" xmlns:w14="http://schemas.microsoft.com/office/word/2010/wordml" xmlns:w15="http://schemas.microsoft.com/office/word/2012/wordml" xmlns:w16cex="http://schemas.microsoft.com/office/word/2018/wordml/cex" xmlns:w16cid="http://schemas.microsoft.com/office/word/2016/wordml/cid" xmlns:w16="http://schemas.microsoft.com/office/word/2018/wordml" xmlns:w16sdtdh="http://schemas.microsoft.com/office/word/2020/wordml/sdtdatahash" xmlns:w16sdtfl="http://schemas.microsoft.com/office/word/2024/wordml/sdtformatlock" xmlns:w16se="http://schemas.microsoft.com/office/word/2015/wordml/symex" xmlns:w16du="http://schemas.microsoft.com/office/word/2023/wordml/word16du" xmlns:wne="http://schemas.microsoft.com/office/word/2006/wordml" mc:Ignorable="w14 w15 w16se w16cid w16 w16cex w16sdtdh w16sdtfl w16du wp14">
+  <w:p>
+    <w:pPr>
+      <w:spacing w:line="20" w:lineRule="exact"/>
+    </w:pPr>
+    <w:r>
+      <w:rPr>
+        <w:noProof/>
+        <w:color w:val="4A4A4A"/>
+        <w:sz w:val="21"/>
+        <w:szCs w:val="21"/>
+      </w:rPr>
+      <w:drawing>
+        <wp:anchor distT="0" distB="0" distL="114300" distR="114300" simplePos="0" relativeHeight="251664384" behindDoc="0" locked="0" layoutInCell="1" allowOverlap="1" wp14:anchorId="61A31DC6" wp14:editId="77F15018">
+          <wp:simplePos x="0" y="0"/>
+          <wp:positionH relativeFrom="margin">
+            <wp:align>center</wp:align>
+          </wp:positionH>
+          <wp:positionV relativeFrom="paragraph">
+            <wp:posOffset>-320040</wp:posOffset>
+          </wp:positionV>
+          <wp:extent cx="7484745" cy="1027944"/>
+          <wp:effectExtent l="0" t="0" r="1905" b="1270"/>
+          <wp:wrapNone/>
+          <wp:docPr id="2109887863" name="Picture 5"/>
+          <wp:cNvGraphicFramePr>
+            <a:graphicFrameLocks xmlns:a="http://schemas.openxmlformats.org/drawingml/2006/main" noChangeAspect="1"/>
+          </wp:cNvGraphicFramePr>
+          <a:graphic xmlns:a="http://schemas.openxmlformats.org/drawingml/2006/main">
+            <a:graphicData uri="http://schemas.openxmlformats.org/drawingml/2006/picture">
+              <pic:pic xmlns:pic="http://schemas.openxmlformats.org/drawingml/2006/picture">
+                <pic:nvPicPr>
+                  <pic:cNvPr id="2109887863" name="Picture 2109887863"/>
+                  <pic:cNvPicPr/>
+                </pic:nvPicPr>
+                <pic:blipFill rotWithShape="1">
+                  <a:blip r:embed="rId1">
+                    <a:extLst>
+                      <a:ext uri="{28A0092B-C50C-407E-A947-70E740481C1C}">
+                        <a14:useLocalDpi xmlns:a14="http://schemas.microsoft.com/office/drawing/2010/main" val="0"/>
+                      </a:ext>
+                    </a:extLst>
+                  </a:blip>
+                  <a:srcRect t="28807" b="29991"/>
+                  <a:stretch>
+                    <a:fillRect/>
+                  </a:stretch>
+                </pic:blipFill>
+                <pic:spPr bwMode="auto">
+                  <a:xfrm>
+                    <a:off x="0" y="0"/>
+                    <a:ext cx="7484745" cy="1027944"/>
+                  </a:xfrm>
+                  <a:prstGeom prst="rect">
+                    <a:avLst/>
+                  </a:prstGeom>
+                  <a:ln>
+                    <a:noFill/>
+                  </a:ln>
+                  <a:extLst>
+                    <a:ext uri="{53640926-AAD7-44D8-BBD7-CCE9431645EC}">
+                      <a14:shadowObscured xmlns:a14="http://schemas.microsoft.com/office/drawing/2010/main"/>
+                    </a:ext>
+                  </a:extLst>
+                </pic:spPr>
+              </pic:pic>
+            </a:graphicData>
+          </a:graphic>
+          <wp14:sizeRelH relativeFrom="page">
+            <wp14:pctWidth>0</wp14:pctWidth>
+          </wp14:sizeRelH>
+          <wp14:sizeRelV relativeFrom="page">
+            <wp14:pctHeight>0</wp14:pctHeight>
+          </wp14:sizeRelV>
+        </wp:anchor>
+      </w:drawing>
+    </w:r>
+    <w:r>
+      <w:fldChar w:fldCharType="begin"/>
+    </w:r>
+    <w:r>
+      <w:instrText xml:space="preserve"> INCLUDEPICTURE "/Users/nourhanzaher/Library/Group Containers/UBF8T346G9.ms/WebArchiveCopyPasteTempFiles/com.microsoft.Word/content?id=file_00000000a67481f49058f5fa4e454a5d&amp;ts=496582&amp;p=fs&amp;cid=1&amp;sig=466adf85f7fce46285143d4ee52a64a2236ea6ab7728988da25bd4ead4b6ab29&amp;v=0" \* MERGEFORMATINET </w:instrText>
+    </w:r>
+    <w:r>
+      <w:fldChar w:fldCharType="separate"/>
+    </w:r>
+    <w:r>
+      <w:rPr>
+        <w:noProof/>
+      </w:rPr>
+      <w:drawing>
+        <wp:inline distT="0" distB="0" distL="0" distR="0" wp14:anchorId="32584B3A" wp14:editId="4FF4D2F4">
+          <wp:extent cx="5943600" cy="1980565"/>
+          <wp:effectExtent l="0" t="0" r="0" b="635"/>
+          <wp:docPr id="1918869755" name="Picture 3" descr="Qatar School Bilingual Header Banner"/>
+          <wp:cNvGraphicFramePr>
+            <a:graphicFrameLocks xmlns:a="http://schemas.openxmlformats.org/drawingml/2006/main" noChangeAspect="1"/>
+          </wp:cNvGraphicFramePr>
+          <a:graphic xmlns:a="http://schemas.openxmlformats.org/drawingml/2006/main">
+            <a:graphicData uri="http://schemas.openxmlformats.org/drawingml/2006/picture">
+              <pic:pic xmlns:pic="http://schemas.openxmlformats.org/drawingml/2006/picture">
+                <pic:nvPicPr>
+                  <pic:cNvPr id="0" name="Picture 5" descr="Qatar School Bilingual Header Banner"/>
+                  <pic:cNvPicPr>
+                    <a:picLocks noChangeAspect="1" noChangeArrowheads="1"/>
+                  </pic:cNvPicPr>
+                </pic:nvPicPr>
+                <pic:blipFill>
+                  <a:blip r:embed="rId1">
+                    <a:extLst>
+                      <a:ext uri="{28A0092B-C50C-407E-A947-70E740481C1C}">
+                        <a14:useLocalDpi xmlns:a14="http://schemas.microsoft.com/office/drawing/2010/main" val="0"/>
+                      </a:ext>
+                    </a:extLst>
+                  </a:blip>
+                  <a:srcRect/>
+                  <a:stretch>
+                    <a:fillRect/>
+                  </a:stretch>
+                </pic:blipFill>
+                <pic:spPr bwMode="auto">
+                  <a:xfrm>
+                    <a:off x="0" y="0"/>
+                    <a:ext cx="5943600" cy="1980565"/>
+                  </a:xfrm>
+                  <a:prstGeom prst="rect">
+                    <a:avLst/>
+                  </a:prstGeom>
+                  <a:noFill/>
+                  <a:ln>
+                    <a:noFill/>
+                  </a:ln>
+                </pic:spPr>
+              </pic:pic>
+            </a:graphicData>
+          </a:graphic>
+        </wp:inline>
+      </w:drawing>
+    </w:r>
+    <w:r>
+      <w:fldChar w:fldCharType="end"/>
+    </w:r>
+  </w:p>
+  <w:p>
+    <w:pPr>
+      <w:spacing w:before="60" w:line="40" w:lineRule="exact"/>
+    </w:pPr>
+    <w:r>
+      <w:rPr>
+        <w:noProof/>
+        <w:color w:val="4A4A4A"/>
+        <w:sz w:val="21"/>
+        <w:szCs w:val="21"/>
+      </w:rPr>
+      <w:drawing>
+        <wp:anchor distT="0" distB="0" distL="114300" distR="114300" simplePos="0" relativeHeight="251663360" behindDoc="1" locked="0" layoutInCell="1" allowOverlap="1" wp14:anchorId="671CE6D1" wp14:editId="56E42AA5">
+          <wp:simplePos x="0" y="0"/>
+          <wp:positionH relativeFrom="column">
+            <wp:posOffset>-520741</wp:posOffset>
+          </wp:positionH>
+          <wp:positionV relativeFrom="paragraph">
+            <wp:posOffset>8743725</wp:posOffset>
+          </wp:positionV>
+          <wp:extent cx="6880162" cy="731066"/>
+          <wp:effectExtent l="0" t="0" r="3810" b="5715"/>
+          <wp:wrapNone/>
+          <wp:docPr id="896384328" name="Picture 2"/>
+          <wp:cNvGraphicFramePr>
+            <a:graphicFrameLocks xmlns:a="http://schemas.openxmlformats.org/drawingml/2006/main" noChangeAspect="1"/>
+          </wp:cNvGraphicFramePr>
+          <a:graphic xmlns:a="http://schemas.openxmlformats.org/drawingml/2006/main">
+            <a:graphicData uri="http://schemas.openxmlformats.org/drawingml/2006/picture">
+              <pic:pic xmlns:pic="http://schemas.openxmlformats.org/drawingml/2006/picture">
+                <pic:nvPicPr>
+                  <pic:cNvPr id="896384328" name="Picture 896384328"/>
+                  <pic:cNvPicPr/>
+                </pic:nvPicPr>
+                <pic:blipFill rotWithShape="1">
+                  <a:blip r:embed="rId2">
+                    <a:extLst>
+                      <a:ext uri="{28A0092B-C50C-407E-A947-70E740481C1C}">
+                        <a14:useLocalDpi xmlns:a14="http://schemas.microsoft.com/office/drawing/2010/main" val="0"/>
+                      </a:ext>
+                    </a:extLst>
+                  </a:blip>
+                  <a:srcRect t="43378" b="25044"/>
+                  <a:stretch>
+                    <a:fillRect/>
+                  </a:stretch>
+                </pic:blipFill>
+                <pic:spPr bwMode="auto">
+                  <a:xfrm>
+                    <a:off x="0" y="0"/>
+                    <a:ext cx="6880162" cy="731066"/>
+                  </a:xfrm>
+                  <a:prstGeom prst="rect">
+                    <a:avLst/>
+                  </a:prstGeom>
+                  <a:ln>
+                    <a:noFill/>
+                  </a:ln>
+                  <a:extLst>
+                    <a:ext uri="{53640926-AAD7-44D8-BBD7-CCE9431645EC}">
+                      <a14:shadowObscured xmlns:a14="http://schemas.microsoft.com/office/drawing/2010/main"/>
+                    </a:ext>
+                  </a:extLst>
+                </pic:spPr>
+              </pic:pic>
+            </a:graphicData>
+          </a:graphic>
+          <wp14:sizeRelH relativeFrom="page">
+            <wp14:pctWidth>0</wp14:pctWidth>
+          </wp14:sizeRelH>
+          <wp14:sizeRelV relativeFrom="page">
+            <wp14:pctHeight>0</wp14:pctHeight>
+          </wp14:sizeRelV>
+        </wp:anchor>
+      </w:drawing>
+    </w:r>
+    <w:r>
+      <w:fldChar w:fldCharType="begin"/>
+    </w:r>
+    <w:r>
+      <w:instrText xml:space="preserve"> INCLUDEPICTURE "/Users/nourhanzaher/Library/Group Containers/UBF8T346G9.ms/WebArchiveCopyPasteTempFiles/com.microsoft.Word/content?id=file_00000000a67481f49058f5fa4e454a5d&amp;ts=496582&amp;p=fs&amp;cid=1&amp;sig=466adf85f7fce46285143d4ee52a64a2236ea6ab7728988da25bd4ead4b6ab29&amp;v=0" \* MERGEFORMATINET </w:instrText>
+    </w:r>
+    <w:r>
+      <w:fldChar w:fldCharType="separate"/>
+    </w:r>
+    <w:r>
+      <w:rPr>
+        <w:noProof/>
+      </w:rPr>
+      <w:drawing>
+        <wp:inline distT="0" distB="0" distL="0" distR="0" wp14:anchorId="17EDC83D" wp14:editId="59A73160">
+          <wp:extent cx="5943600" cy="1980565"/>
+          <wp:effectExtent l="0" t="0" r="0" b="635"/>
+          <wp:docPr id="1607505442" name="Picture 4" descr="Qatar School Bilingual Header Banner"/>
+          <wp:cNvGraphicFramePr>
+            <a:graphicFrameLocks xmlns:a="http://schemas.openxmlformats.org/drawingml/2006/main" noChangeAspect="1"/>
+          </wp:cNvGraphicFramePr>
+          <a:graphic xmlns:a="http://schemas.openxmlformats.org/drawingml/2006/main">
+            <a:graphicData uri="http://schemas.openxmlformats.org/drawingml/2006/picture">
+              <pic:pic xmlns:pic="http://schemas.openxmlformats.org/drawingml/2006/picture">
+                <pic:nvPicPr>
+                  <pic:cNvPr id="0" name="Picture 9" descr="Qatar School Bilingual Header Banner"/>
+                  <pic:cNvPicPr>
+                    <a:picLocks noChangeAspect="1" noChangeArrowheads="1"/>
+                  </pic:cNvPicPr>
+                </pic:nvPicPr>
+                <pic:blipFill>
+                  <a:blip r:embed="rId1">
+                    <a:extLst>
+                      <a:ext uri="{28A0092B-C50C-407E-A947-70E740481C1C}">
+                        <a14:useLocalDpi xmlns:a14="http://schemas.microsoft.com/office/drawing/2010/main" val="0"/>
+                      </a:ext>
+                    </a:extLst>
+                  </a:blip>
+                  <a:srcRect/>
+                  <a:stretch>
+                    <a:fillRect/>
+                  </a:stretch>
+                </pic:blipFill>
+                <pic:spPr bwMode="auto">
+                  <a:xfrm>
+                    <a:off x="0" y="0"/>
+                    <a:ext cx="5943600" cy="1980565"/>
+                  </a:xfrm>
+                  <a:prstGeom prst="rect">
+                    <a:avLst/>
+                  </a:prstGeom>
+                  <a:noFill/>
+                  <a:ln>
+                    <a:noFill/>
+                  </a:ln>
+                </pic:spPr>
+              </pic:pic>
+            </a:graphicData>
+          </a:graphic>
+        </wp:inline>
+      </w:drawing>
+    </w:r>
+    <w:r>
+      <w:fldChar w:fldCharType="end"/>
+    </w:r>
+  </w:p>
+</w:hdr>
 </file>
 
 <file path=word/numbering.xml><?xml version="1.0" encoding="utf-8"?>

</xml_diff>

<commit_message>
Fix footer display: replace table-based footer with simple paragraph
The previous template footer used a complex table layout that didn't
render in Word. Simplified to a right-aligned paragraph with PAGE/NUMPAGES
fields. Increased footer margin from 400 to 720 twips for reliable display.
</commit_message>
<xml_diff>
--- a/2026 الى 2027/التكليف 2026/الفصل الأول/تكليف الاختبارات للفصل الاول -كيمياء 2026.docx
+++ b/2026 الى 2027/التكليف 2026/الفصل الأول/تكليف الاختبارات للفصل الاول -كيمياء 2026.docx
@@ -2104,7 +2104,7 @@
       <w:headerReference w:type="default" r:id="rId21"/>
       <w:footerReference w:type="default" r:id="rId22"/>
       <w:pgSz w:w="15840" w:h="12240" w:orient="landscape"/>
-      <w:pgMar w:top="1750" w:right="720" w:bottom="1750" w:left="720" w:header="500" w:footer="400" w:gutter="0"/>
+      <w:pgMar w:top="1750" w:right="720" w:bottom="1440" w:left="720" w:header="500" w:footer="720" w:gutter="0"/>
       <w:cols w:space="720"/>
       <w:docGrid w:linePitch="360"/>
     </w:sectPr>
@@ -2138,177 +2138,131 @@
 </file>
 
 <file path=word/footer1.xml><?xml version="1.0" encoding="utf-8"?>
-<w:ftr xmlns:wpc="http://schemas.microsoft.com/office/word/2010/wordprocessingCanvas" xmlns:cx="http://schemas.microsoft.com/office/drawing/2014/chartex" xmlns:cx1="http://schemas.microsoft.com/office/drawing/2015/9/8/chartex" xmlns:cx2="http://schemas.microsoft.com/office/drawing/2015/10/21/chartex" xmlns:cx3="http://schemas.microsoft.com/office/drawing/2016/5/9/chartex" xmlns:cx4="http://schemas.microsoft.com/office/drawing/2016/5/10/chartex" xmlns:cx5="http://schemas.microsoft.com/office/drawing/2016/5/11/chartex" xmlns:cx6="http://schemas.microsoft.com/office/drawing/2016/5/12/chartex" xmlns:cx7="http://schemas.microsoft.com/office/drawing/2016/5/13/chartex" xmlns:cx8="http://schemas.microsoft.com/office/drawing/2016/5/14/chartex" xmlns:mc="http://schemas.openxmlformats.org/markup-compatibility/2006" xmlns:m="http://schemas.openxmlformats.org/officeDocument/2006/math" xmlns:aink="http://schemas.microsoft.com/office/drawing/2016/ink" xmlns:am3d="http://schemas.microsoft.com/office/drawing/2017/model3d" xmlns:oel="http://schemas.microsoft.com/office/2019/extlst" xmlns:r="http://schemas.openxmlformats.org/officeDocument/2006/relationships" xmlns:wp14="http://schemas.microsoft.com/office/word/2010/wordprocessingDrawing" xmlns:wp="http://schemas.openxmlformats.org/drawingml/2006/wordprocessingDrawing" xmlns:wpg="http://schemas.microsoft.com/office/word/2010/wordprocessingGroup" xmlns:wpi="http://schemas.microsoft.com/office/word/2010/wordprocessingInk" xmlns:wps="http://schemas.microsoft.com/office/word/2010/wordprocessingShape" xmlns:o="urn:schemas-microsoft-com:office:office" xmlns:v="urn:schemas-microsoft-com:vml" xmlns:w10="urn:schemas-microsoft-com:office:word" xmlns:w="http://schemas.openxmlformats.org/wordprocessingml/2006/main" xmlns:w14="http://schemas.microsoft.com/office/word/2010/wordml" xmlns:w15="http://schemas.microsoft.com/office/word/2012/wordml" xmlns:w16cex="http://schemas.microsoft.com/office/word/2018/wordml/cex" xmlns:w16cid="http://schemas.microsoft.com/office/word/2016/wordml/cid" xmlns:w16="http://schemas.microsoft.com/office/word/2018/wordml" xmlns:w16sdtdh="http://schemas.microsoft.com/office/word/2020/wordml/sdtdatahash" xmlns:w16sdtfl="http://schemas.microsoft.com/office/word/2024/wordml/sdtformatlock" xmlns:w16se="http://schemas.microsoft.com/office/word/2015/wordml/symex" xmlns:w16du="http://schemas.microsoft.com/office/word/2023/wordml/word16du" xmlns:wne="http://schemas.microsoft.com/office/word/2006/wordml" mc:Ignorable="w14 w15 w16se w16cid w16 w16cex w16sdtdh w16sdtfl w16du wp14">
-  <w:tbl>
-    <w:tblPr>
-      <w:tblW w:w="11290" w:type="dxa"/>
-      <w:tblInd w:w="-958" w:type="dxa"/>
-      <w:tblBorders>
-        <w:top w:val="none" w:sz="0" w:space="0" w:color="FFFFFF"/>
-        <w:left w:val="none" w:sz="0" w:space="0" w:color="FFFFFF"/>
-        <w:bottom w:val="none" w:sz="0" w:space="0" w:color="FFFFFF"/>
-        <w:right w:val="none" w:sz="0" w:space="0" w:color="FFFFFF"/>
-        <w:insideH w:val="none" w:sz="0" w:space="0" w:color="FFFFFF"/>
-        <w:insideV w:val="none" w:sz="0" w:space="0" w:color="FFFFFF"/>
-      </w:tblBorders>
-      <w:tblLayout w:type="fixed"/>
-      <w:tblCellMar>
-        <w:left w:w="10" w:type="dxa"/>
-        <w:right w:w="10" w:type="dxa"/>
-      </w:tblCellMar>
-      <w:tblLook w:val="04A0" w:firstRow="1" w:lastRow="0" w:firstColumn="1" w:lastColumn="0" w:noHBand="0" w:noVBand="1"/>
-    </w:tblPr>
-    <w:tblGrid>
-      <w:gridCol w:w="11290"/>
-    </w:tblGrid>
-    <w:tr>
-      <w:trPr>
-        <w:trHeight w:val="43"/>
-      </w:trPr>
-      <w:tc>
-        <w:tcPr>
-          <w:tcW w:w="11290" w:type="dxa"/>
-          <w:tcBorders>
-            <w:top w:val="none" w:sz="0" w:space="0" w:color="FFFFFF"/>
-            <w:left w:val="none" w:sz="0" w:space="0" w:color="FFFFFF"/>
-            <w:bottom w:val="none" w:sz="0" w:space="0" w:color="FFFFFF"/>
-            <w:right w:val="none" w:sz="0" w:space="0" w:color="FFFFFF"/>
-          </w:tcBorders>
-          <w:tcMar>
-            <w:top w:w="50" w:type="dxa"/>
-            <w:left w:w="0" w:type="dxa"/>
-            <w:bottom w:w="0" w:type="dxa"/>
-            <w:right w:w="0" w:type="dxa"/>
-          </w:tcMar>
-          <w:vAlign w:val="center"/>
-        </w:tcPr>
-        <w:p>
-          <w:pPr>
-            <w:spacing w:line="180" w:lineRule="exact"/>
-            <w:jc w:val="right"/>
-          </w:pPr>
-          <w:r>
-            <w:rPr>
-              <w:color w:val="4A4A4A"/>
-              <w:sz w:val="21"/>
-              <w:szCs w:val="21"/>
-            </w:rPr>
-            <w:t xml:space="preserve">Page </w:t>
-          </w:r>
-          <w:r>
-            <w:rPr>
-              <w:b/>
-              <w:bCs/>
-              <w:color w:val="C9A227"/>
-              <w:sz w:val="22"/>
-              <w:szCs w:val="22"/>
-            </w:rPr>
-            <w:fldChar w:fldCharType="begin"/>
-          </w:r>
-          <w:r>
-            <w:rPr>
-              <w:b/>
-              <w:bCs/>
-              <w:color w:val="C9A227"/>
-              <w:sz w:val="22"/>
-              <w:szCs w:val="22"/>
-            </w:rPr>
-            <w:instrText>PAGE</w:instrText>
-          </w:r>
-          <w:r>
-            <w:rPr>
-              <w:b/>
-              <w:bCs/>
-              <w:color w:val="C9A227"/>
-              <w:sz w:val="22"/>
-              <w:szCs w:val="22"/>
-            </w:rPr>
-            <w:fldChar w:fldCharType="separate"/>
-          </w:r>
-          <w:r>
-            <w:rPr>
-              <w:b/>
-              <w:bCs/>
-              <w:noProof/>
-              <w:color w:val="C9A227"/>
-              <w:sz w:val="22"/>
-              <w:szCs w:val="22"/>
-            </w:rPr>
-            <w:t>1</w:t>
-          </w:r>
-          <w:r>
-            <w:rPr>
-              <w:b/>
-              <w:bCs/>
-              <w:color w:val="C9A227"/>
-              <w:sz w:val="22"/>
-              <w:szCs w:val="22"/>
-            </w:rPr>
-            <w:fldChar w:fldCharType="end"/>
-          </w:r>
-          <w:r>
-            <w:rPr>
-              <w:color w:val="4A4A4A"/>
-              <w:sz w:val="21"/>
-              <w:szCs w:val="21"/>
-            </w:rPr>
-            <w:t xml:space="preserve"> / </w:t>
-          </w:r>
-          <w:r>
-            <w:rPr>
-              <w:b/>
-              <w:bCs/>
-              <w:color w:val="C9A227"/>
-              <w:sz w:val="22"/>
-              <w:szCs w:val="22"/>
-            </w:rPr>
-            <w:fldChar w:fldCharType="begin"/>
-          </w:r>
-          <w:r>
-            <w:rPr>
-              <w:b/>
-              <w:bCs/>
-              <w:color w:val="C9A227"/>
-              <w:sz w:val="22"/>
-              <w:szCs w:val="22"/>
-            </w:rPr>
-            <w:instrText>NUMPAGES</w:instrText>
-          </w:r>
-          <w:r>
-            <w:rPr>
-              <w:b/>
-              <w:bCs/>
-              <w:color w:val="C9A227"/>
-              <w:sz w:val="22"/>
-              <w:szCs w:val="22"/>
-            </w:rPr>
-            <w:fldChar w:fldCharType="separate"/>
-          </w:r>
-          <w:r>
-            <w:rPr>
-              <w:b/>
-              <w:bCs/>
-              <w:noProof/>
-              <w:color w:val="C9A227"/>
-              <w:sz w:val="22"/>
-              <w:szCs w:val="22"/>
-            </w:rPr>
-            <w:t>1</w:t>
-          </w:r>
-          <w:r>
-            <w:rPr>
-              <w:b/>
-              <w:bCs/>
-              <w:color w:val="C9A227"/>
-              <w:sz w:val="22"/>
-              <w:szCs w:val="22"/>
-            </w:rPr>
-            <w:fldChar w:fldCharType="end"/>
-          </w:r>
-        </w:p>
-      </w:tc>
-    </w:tr>
-  </w:tbl>
+<w:ftr xmlns:w="http://schemas.openxmlformats.org/wordprocessingml/2006/main" xmlns:r="http://schemas.openxmlformats.org/officeDocument/2006/relationships" xmlns:mc="http://schemas.openxmlformats.org/markup-compatibility/2006" xmlns:w14="http://schemas.microsoft.com/office/word/2010/wordml" mc:Ignorable="w14">
+  <w:p>
+    <w:pPr>
+      <w:pStyle w:val="Footer"/>
+      <w:jc w:val="right"/>
+    </w:pPr>
+    <w:r>
+      <w:rPr>
+        <w:color w:val="4A4A4A"/>
+        <w:sz w:val="21"/>
+        <w:szCs w:val="21"/>
+      </w:rPr>
+      <w:t xml:space="preserve">Page </w:t>
+    </w:r>
+    <w:r>
+      <w:rPr>
+        <w:b/>
+        <w:bCs/>
+        <w:color w:val="C9A227"/>
+        <w:sz w:val="22"/>
+        <w:szCs w:val="22"/>
+      </w:rPr>
+      <w:fldChar w:fldCharType="begin"/>
+    </w:r>
+    <w:r>
+      <w:rPr>
+        <w:b/>
+        <w:bCs/>
+        <w:color w:val="C9A227"/>
+        <w:sz w:val="22"/>
+        <w:szCs w:val="22"/>
+      </w:rPr>
+      <w:instrText xml:space="preserve"> PAGE </w:instrText>
+    </w:r>
+    <w:r>
+      <w:rPr>
+        <w:b/>
+        <w:bCs/>
+        <w:color w:val="C9A227"/>
+        <w:sz w:val="22"/>
+        <w:szCs w:val="22"/>
+      </w:rPr>
+      <w:fldChar w:fldCharType="separate"/>
+    </w:r>
+    <w:r>
+      <w:rPr>
+        <w:b/>
+        <w:bCs/>
+        <w:noProof/>
+        <w:color w:val="C9A227"/>
+        <w:sz w:val="22"/>
+        <w:szCs w:val="22"/>
+      </w:rPr>
+      <w:t>1</w:t>
+    </w:r>
+    <w:r>
+      <w:rPr>
+        <w:b/>
+        <w:bCs/>
+        <w:color w:val="C9A227"/>
+        <w:sz w:val="22"/>
+        <w:szCs w:val="22"/>
+      </w:rPr>
+      <w:fldChar w:fldCharType="end"/>
+    </w:r>
+    <w:r>
+      <w:rPr>
+        <w:color w:val="4A4A4A"/>
+        <w:sz w:val="21"/>
+        <w:szCs w:val="21"/>
+      </w:rPr>
+      <w:t xml:space="preserve"> / </w:t>
+    </w:r>
+    <w:r>
+      <w:rPr>
+        <w:b/>
+        <w:bCs/>
+        <w:color w:val="C9A227"/>
+        <w:sz w:val="22"/>
+        <w:szCs w:val="22"/>
+      </w:rPr>
+      <w:fldChar w:fldCharType="begin"/>
+    </w:r>
+    <w:r>
+      <w:rPr>
+        <w:b/>
+        <w:bCs/>
+        <w:color w:val="C9A227"/>
+        <w:sz w:val="22"/>
+        <w:szCs w:val="22"/>
+      </w:rPr>
+      <w:instrText xml:space="preserve"> NUMPAGES </w:instrText>
+    </w:r>
+    <w:r>
+      <w:rPr>
+        <w:b/>
+        <w:bCs/>
+        <w:color w:val="C9A227"/>
+        <w:sz w:val="22"/>
+        <w:szCs w:val="22"/>
+      </w:rPr>
+      <w:fldChar w:fldCharType="separate"/>
+    </w:r>
+    <w:r>
+      <w:rPr>
+        <w:b/>
+        <w:bCs/>
+        <w:noProof/>
+        <w:color w:val="C9A227"/>
+        <w:sz w:val="22"/>
+        <w:szCs w:val="22"/>
+      </w:rPr>
+      <w:t>1</w:t>
+    </w:r>
+    <w:r>
+      <w:rPr>
+        <w:b/>
+        <w:bCs/>
+        <w:color w:val="C9A227"/>
+        <w:sz w:val="22"/>
+        <w:szCs w:val="22"/>
+      </w:rPr>
+      <w:fldChar w:fldCharType="end"/>
+    </w:r>
+  </w:p>
 </w:ftr>
 </file>
 

</xml_diff>

<commit_message>
Remove old body-embedded headers and use python-docx for header/footer
Old header banner images were embedded in the document body (first
paragraphs) in addition to the header area. Removed those body-embedded
headers (161 elements across 74 files) so only the new template header
shows. Used python-docx for proper OOXML relationship management.
</commit_message>
<xml_diff>
--- a/2026 الى 2027/التكليف 2026/الفصل الأول/تكليف الاختبارات للفصل الاول -كيمياء 2026.docx
+++ b/2026 الى 2027/التكليف 2026/الفصل الأول/تكليف الاختبارات للفصل الاول -كيمياء 2026.docx
@@ -2,147 +2,6 @@
 <file path=word/document.xml><?xml version="1.0" encoding="utf-8"?>
 <w:document xmlns:wpc="http://schemas.microsoft.com/office/word/2010/wordprocessingCanvas" xmlns:cx="http://schemas.microsoft.com/office/drawing/2014/chartex" xmlns:cx1="http://schemas.microsoft.com/office/drawing/2015/9/8/chartex" xmlns:cx2="http://schemas.microsoft.com/office/drawing/2015/10/21/chartex" xmlns:cx3="http://schemas.microsoft.com/office/drawing/2016/5/9/chartex" xmlns:cx4="http://schemas.microsoft.com/office/drawing/2016/5/10/chartex" xmlns:cx5="http://schemas.microsoft.com/office/drawing/2016/5/11/chartex" xmlns:cx6="http://schemas.microsoft.com/office/drawing/2016/5/12/chartex" xmlns:cx7="http://schemas.microsoft.com/office/drawing/2016/5/13/chartex" xmlns:cx8="http://schemas.microsoft.com/office/drawing/2016/5/14/chartex" xmlns:mc="http://schemas.openxmlformats.org/markup-compatibility/2006" xmlns:aink="http://schemas.microsoft.com/office/drawing/2016/ink" xmlns:am3d="http://schemas.microsoft.com/office/drawing/2017/model3d" xmlns:o="urn:schemas-microsoft-com:office:office" xmlns:oel="http://schemas.microsoft.com/office/2019/extlst" xmlns:r="http://schemas.openxmlformats.org/officeDocument/2006/relationships" xmlns:m="http://schemas.openxmlformats.org/officeDocument/2006/math" xmlns:v="urn:schemas-microsoft-com:vml" xmlns:wp14="http://schemas.microsoft.com/office/word/2010/wordprocessingDrawing" xmlns:wp="http://schemas.openxmlformats.org/drawingml/2006/wordprocessingDrawing" xmlns:w10="urn:schemas-microsoft-com:office:word" xmlns:w="http://schemas.openxmlformats.org/wordprocessingml/2006/main" xmlns:w14="http://schemas.microsoft.com/office/word/2010/wordml" xmlns:w15="http://schemas.microsoft.com/office/word/2012/wordml" xmlns:w16cex="http://schemas.microsoft.com/office/word/2018/wordml/cex" xmlns:w16cid="http://schemas.microsoft.com/office/word/2016/wordml/cid" xmlns:w16="http://schemas.microsoft.com/office/word/2018/wordml" xmlns:w16du="http://schemas.microsoft.com/office/word/2023/wordml/word16du" xmlns:w16sdtdh="http://schemas.microsoft.com/office/word/2020/wordml/sdtdatahash" xmlns:w16sdtfl="http://schemas.microsoft.com/office/word/2024/wordml/sdtformatlock" xmlns:w16se="http://schemas.microsoft.com/office/word/2015/wordml/symex" xmlns:wpg="http://schemas.microsoft.com/office/word/2010/wordprocessingGroup" xmlns:wpi="http://schemas.microsoft.com/office/word/2010/wordprocessingInk" xmlns:wne="http://schemas.microsoft.com/office/word/2006/wordml" xmlns:wps="http://schemas.microsoft.com/office/word/2010/wordprocessingShape" mc:Ignorable="w14 w15 w16se w16cid w16 w16cex w16sdtdh w16sdtfl w16du wp14">
   <w:body>
-    <w:p>
-      <w:r>
-        <w:rPr>
-          <w:noProof/>
-        </w:rPr>
-        <w:drawing>
-          <wp:anchor distT="0" distB="0" distL="114300" distR="114300" simplePos="0" relativeHeight="251661312" behindDoc="0" locked="0" layoutInCell="1" allowOverlap="1" wp14:anchorId="341AC6A6" wp14:editId="148B42E3">
-            <wp:simplePos x="0" y="0"/>
-            <wp:positionH relativeFrom="margin">
-              <wp:align>right</wp:align>
-            </wp:positionH>
-            <wp:positionV relativeFrom="paragraph">
-              <wp:posOffset>-333632</wp:posOffset>
-            </wp:positionV>
-            <wp:extent cx="9150178" cy="753745"/>
-            <wp:effectExtent l="0" t="0" r="0" b="8255"/>
-            <wp:wrapNone/>
-            <wp:docPr id="1051293718" name="Picture 1"/>
-            <wp:cNvGraphicFramePr>
-              <a:graphicFrameLocks xmlns:a="http://schemas.openxmlformats.org/drawingml/2006/main" noChangeAspect="1"/>
-            </wp:cNvGraphicFramePr>
-            <a:graphic xmlns:a="http://schemas.openxmlformats.org/drawingml/2006/main">
-              <a:graphicData uri="http://schemas.openxmlformats.org/drawingml/2006/picture">
-                <pic:pic xmlns:pic="http://schemas.openxmlformats.org/drawingml/2006/picture">
-                  <pic:nvPicPr>
-                    <pic:cNvPr id="0" name="Picture 1"/>
-                    <pic:cNvPicPr>
-                      <a:picLocks noChangeAspect="1" noChangeArrowheads="1"/>
-                    </pic:cNvPicPr>
-                  </pic:nvPicPr>
-                  <pic:blipFill>
-                    <a:blip r:embed="rId10">
-                      <a:extLst>
-                        <a:ext uri="{28A0092B-C50C-407E-A947-70E740481C1C}">
-                          <a14:useLocalDpi xmlns:a14="http://schemas.microsoft.com/office/drawing/2010/main" val="0"/>
-                        </a:ext>
-                      </a:extLst>
-                    </a:blip>
-                    <a:srcRect/>
-                    <a:stretch>
-                      <a:fillRect/>
-                    </a:stretch>
-                  </pic:blipFill>
-                  <pic:spPr bwMode="auto">
-                    <a:xfrm>
-                      <a:off x="0" y="0"/>
-                      <a:ext cx="9150178" cy="753745"/>
-                    </a:xfrm>
-                    <a:prstGeom prst="rect">
-                      <a:avLst/>
-                    </a:prstGeom>
-                    <a:noFill/>
-                    <a:ln>
-                      <a:noFill/>
-                    </a:ln>
-                  </pic:spPr>
-                </pic:pic>
-              </a:graphicData>
-            </a:graphic>
-            <wp14:sizeRelH relativeFrom="margin">
-              <wp14:pctWidth>0</wp14:pctWidth>
-            </wp14:sizeRelH>
-          </wp:anchor>
-        </w:drawing>
-      </w:r>
-      <w:r>
-        <w:rPr>
-          <w:noProof/>
-        </w:rPr>
-        <w:drawing>
-          <wp:anchor distT="0" distB="0" distL="114300" distR="114300" simplePos="0" relativeHeight="251659264" behindDoc="0" locked="0" layoutInCell="1" allowOverlap="1" wp14:anchorId="2F5B5AFC" wp14:editId="48AE4D9E">
-            <wp:simplePos x="0" y="0"/>
-            <wp:positionH relativeFrom="margin">
-              <wp:align>right</wp:align>
-            </wp:positionH>
-            <wp:positionV relativeFrom="paragraph">
-              <wp:posOffset>9134915</wp:posOffset>
-            </wp:positionV>
-            <wp:extent cx="6629400" cy="413385"/>
-            <wp:effectExtent l="0" t="0" r="0" b="5715"/>
-            <wp:wrapNone/>
-            <wp:docPr id="2" name="Picture 2"/>
-            <wp:cNvGraphicFramePr>
-              <a:graphicFrameLocks xmlns:a="http://schemas.openxmlformats.org/drawingml/2006/main" noChangeAspect="1"/>
-            </wp:cNvGraphicFramePr>
-            <a:graphic xmlns:a="http://schemas.openxmlformats.org/drawingml/2006/main">
-              <a:graphicData uri="http://schemas.openxmlformats.org/drawingml/2006/picture">
-                <pic:pic xmlns:pic="http://schemas.openxmlformats.org/drawingml/2006/picture">
-                  <pic:nvPicPr>
-                    <pic:cNvPr id="0" name="Picture 2"/>
-                    <pic:cNvPicPr>
-                      <a:picLocks noChangeAspect="1" noChangeArrowheads="1"/>
-                    </pic:cNvPicPr>
-                  </pic:nvPicPr>
-                  <pic:blipFill>
-                    <a:blip r:embed="rId11">
-                      <a:extLst>
-                        <a:ext uri="{28A0092B-C50C-407E-A947-70E740481C1C}">
-                          <a14:useLocalDpi xmlns:a14="http://schemas.microsoft.com/office/drawing/2010/main" val="0"/>
-                        </a:ext>
-                      </a:extLst>
-                    </a:blip>
-                    <a:srcRect/>
-                    <a:stretch>
-                      <a:fillRect/>
-                    </a:stretch>
-                  </pic:blipFill>
-                  <pic:spPr bwMode="auto">
-                    <a:xfrm>
-                      <a:off x="0" y="0"/>
-                      <a:ext cx="6629400" cy="413385"/>
-                    </a:xfrm>
-                    <a:prstGeom prst="rect">
-                      <a:avLst/>
-                    </a:prstGeom>
-                    <a:noFill/>
-                    <a:ln>
-                      <a:noFill/>
-                    </a:ln>
-                  </pic:spPr>
-                </pic:pic>
-              </a:graphicData>
-            </a:graphic>
-          </wp:anchor>
-        </w:drawing>
-      </w:r>
-    </w:p>
-    <w:p>
-      <w:pPr>
-        <w:jc w:val="right"/>
-        <w:rPr>
-          <w:b/>
-          <w:bCs/>
-          <w:sz w:val="28"/>
-          <w:szCs w:val="28"/>
-          <w:u w:val="single"/>
-          <w:rtl/>
-          <w:lang w:bidi="ar-QA"/>
-        </w:rPr>
-      </w:pPr>
-    </w:p>
     <w:p>
       <w:pPr>
         <w:shd w:val="clear" w:color="auto" w:fill="FBE4D5" w:themeFill="accent2" w:themeFillTint="33"/>
@@ -2138,131 +1997,177 @@
 </file>
 
 <file path=word/footer1.xml><?xml version="1.0" encoding="utf-8"?>
-<w:ftr xmlns:w="http://schemas.openxmlformats.org/wordprocessingml/2006/main" xmlns:r="http://schemas.openxmlformats.org/officeDocument/2006/relationships" xmlns:mc="http://schemas.openxmlformats.org/markup-compatibility/2006" xmlns:w14="http://schemas.microsoft.com/office/word/2010/wordml" mc:Ignorable="w14">
-  <w:p>
-    <w:pPr>
-      <w:pStyle w:val="Footer"/>
-      <w:jc w:val="right"/>
-    </w:pPr>
-    <w:r>
-      <w:rPr>
-        <w:color w:val="4A4A4A"/>
-        <w:sz w:val="21"/>
-        <w:szCs w:val="21"/>
-      </w:rPr>
-      <w:t xml:space="preserve">Page </w:t>
-    </w:r>
-    <w:r>
-      <w:rPr>
-        <w:b/>
-        <w:bCs/>
-        <w:color w:val="C9A227"/>
-        <w:sz w:val="22"/>
-        <w:szCs w:val="22"/>
-      </w:rPr>
-      <w:fldChar w:fldCharType="begin"/>
-    </w:r>
-    <w:r>
-      <w:rPr>
-        <w:b/>
-        <w:bCs/>
-        <w:color w:val="C9A227"/>
-        <w:sz w:val="22"/>
-        <w:szCs w:val="22"/>
-      </w:rPr>
-      <w:instrText xml:space="preserve"> PAGE </w:instrText>
-    </w:r>
-    <w:r>
-      <w:rPr>
-        <w:b/>
-        <w:bCs/>
-        <w:color w:val="C9A227"/>
-        <w:sz w:val="22"/>
-        <w:szCs w:val="22"/>
-      </w:rPr>
-      <w:fldChar w:fldCharType="separate"/>
-    </w:r>
-    <w:r>
-      <w:rPr>
-        <w:b/>
-        <w:bCs/>
-        <w:noProof/>
-        <w:color w:val="C9A227"/>
-        <w:sz w:val="22"/>
-        <w:szCs w:val="22"/>
-      </w:rPr>
-      <w:t>1</w:t>
-    </w:r>
-    <w:r>
-      <w:rPr>
-        <w:b/>
-        <w:bCs/>
-        <w:color w:val="C9A227"/>
-        <w:sz w:val="22"/>
-        <w:szCs w:val="22"/>
-      </w:rPr>
-      <w:fldChar w:fldCharType="end"/>
-    </w:r>
-    <w:r>
-      <w:rPr>
-        <w:color w:val="4A4A4A"/>
-        <w:sz w:val="21"/>
-        <w:szCs w:val="21"/>
-      </w:rPr>
-      <w:t xml:space="preserve"> / </w:t>
-    </w:r>
-    <w:r>
-      <w:rPr>
-        <w:b/>
-        <w:bCs/>
-        <w:color w:val="C9A227"/>
-        <w:sz w:val="22"/>
-        <w:szCs w:val="22"/>
-      </w:rPr>
-      <w:fldChar w:fldCharType="begin"/>
-    </w:r>
-    <w:r>
-      <w:rPr>
-        <w:b/>
-        <w:bCs/>
-        <w:color w:val="C9A227"/>
-        <w:sz w:val="22"/>
-        <w:szCs w:val="22"/>
-      </w:rPr>
-      <w:instrText xml:space="preserve"> NUMPAGES </w:instrText>
-    </w:r>
-    <w:r>
-      <w:rPr>
-        <w:b/>
-        <w:bCs/>
-        <w:color w:val="C9A227"/>
-        <w:sz w:val="22"/>
-        <w:szCs w:val="22"/>
-      </w:rPr>
-      <w:fldChar w:fldCharType="separate"/>
-    </w:r>
-    <w:r>
-      <w:rPr>
-        <w:b/>
-        <w:bCs/>
-        <w:noProof/>
-        <w:color w:val="C9A227"/>
-        <w:sz w:val="22"/>
-        <w:szCs w:val="22"/>
-      </w:rPr>
-      <w:t>1</w:t>
-    </w:r>
-    <w:r>
-      <w:rPr>
-        <w:b/>
-        <w:bCs/>
-        <w:color w:val="C9A227"/>
-        <w:sz w:val="22"/>
-        <w:szCs w:val="22"/>
-      </w:rPr>
-      <w:fldChar w:fldCharType="end"/>
-    </w:r>
-  </w:p>
+<w:ftr xmlns:m="http://schemas.openxmlformats.org/officeDocument/2006/math" xmlns:mc="http://schemas.openxmlformats.org/markup-compatibility/2006" xmlns:mo="http://schemas.microsoft.com/office/mac/office/2008/main" xmlns:mv="urn:schemas-microsoft-com:mac:vml" xmlns:o="urn:schemas-microsoft-com:office:office" xmlns:r="http://schemas.openxmlformats.org/officeDocument/2006/relationships" xmlns:v="urn:schemas-microsoft-com:vml" xmlns:w10="urn:schemas-microsoft-com:office:word" xmlns:w14="http://schemas.microsoft.com/office/word/2010/wordml" xmlns:w="http://schemas.openxmlformats.org/wordprocessingml/2006/main" xmlns:wne="http://schemas.microsoft.com/office/word/2006/wordml" xmlns:wp14="http://schemas.microsoft.com/office/word/2010/wordprocessingDrawing" xmlns:wp="http://schemas.openxmlformats.org/drawingml/2006/wordprocessingDrawing" xmlns:wpc="http://schemas.microsoft.com/office/word/2010/wordprocessingCanvas" xmlns:wpg="http://schemas.microsoft.com/office/word/2010/wordprocessingGroup" xmlns:wpi="http://schemas.microsoft.com/office/word/2010/wordprocessingInk" xmlns:wps="http://schemas.microsoft.com/office/word/2010/wordprocessingShape" mc:Ignorable="w14 wp14">
+  <w:tbl>
+    <w:tblPr>
+      <w:tblW w:w="11290" w:type="dxa"/>
+      <w:tblInd w:w="-958" w:type="dxa"/>
+      <w:tblBorders>
+        <w:top w:val="none" w:sz="0" w:space="0" w:color="FFFFFF"/>
+        <w:left w:val="none" w:sz="0" w:space="0" w:color="FFFFFF"/>
+        <w:bottom w:val="none" w:sz="0" w:space="0" w:color="FFFFFF"/>
+        <w:right w:val="none" w:sz="0" w:space="0" w:color="FFFFFF"/>
+        <w:insideH w:val="none" w:sz="0" w:space="0" w:color="FFFFFF"/>
+        <w:insideV w:val="none" w:sz="0" w:space="0" w:color="FFFFFF"/>
+      </w:tblBorders>
+      <w:tblLayout w:type="fixed"/>
+      <w:tblCellMar>
+        <w:left w:w="10" w:type="dxa"/>
+        <w:right w:w="10" w:type="dxa"/>
+      </w:tblCellMar>
+      <w:tblLook w:val="04A0" w:firstRow="1" w:lastRow="0" w:firstColumn="1" w:lastColumn="0" w:noHBand="0" w:noVBand="1"/>
+    </w:tblPr>
+    <w:tblGrid>
+      <w:gridCol w:w="11290"/>
+    </w:tblGrid>
+    <w:tr>
+      <w:trPr>
+        <w:trHeight w:val="43"/>
+      </w:trPr>
+      <w:tc>
+        <w:tcPr>
+          <w:tcW w:w="11290" w:type="dxa"/>
+          <w:tcBorders>
+            <w:top w:val="none" w:sz="0" w:space="0" w:color="FFFFFF"/>
+            <w:left w:val="none" w:sz="0" w:space="0" w:color="FFFFFF"/>
+            <w:bottom w:val="none" w:sz="0" w:space="0" w:color="FFFFFF"/>
+            <w:right w:val="none" w:sz="0" w:space="0" w:color="FFFFFF"/>
+          </w:tcBorders>
+          <w:tcMar>
+            <w:top w:w="50" w:type="dxa"/>
+            <w:left w:w="0" w:type="dxa"/>
+            <w:bottom w:w="0" w:type="dxa"/>
+            <w:right w:w="0" w:type="dxa"/>
+          </w:tcMar>
+          <w:vAlign w:val="center"/>
+        </w:tcPr>
+        <w:p>
+          <w:pPr>
+            <w:spacing w:line="180" w:lineRule="exact"/>
+            <w:jc w:val="right"/>
+          </w:pPr>
+          <w:r>
+            <w:rPr>
+              <w:color w:val="4A4A4A"/>
+              <w:sz w:val="21"/>
+              <w:szCs w:val="21"/>
+            </w:rPr>
+            <w:t xml:space="preserve">Page </w:t>
+          </w:r>
+          <w:r>
+            <w:rPr>
+              <w:b/>
+              <w:bCs/>
+              <w:color w:val="C9A227"/>
+              <w:sz w:val="22"/>
+              <w:szCs w:val="22"/>
+            </w:rPr>
+            <w:fldChar w:fldCharType="begin"/>
+          </w:r>
+          <w:r>
+            <w:rPr>
+              <w:b/>
+              <w:bCs/>
+              <w:color w:val="C9A227"/>
+              <w:sz w:val="22"/>
+              <w:szCs w:val="22"/>
+            </w:rPr>
+            <w:instrText>PAGE</w:instrText>
+          </w:r>
+          <w:r>
+            <w:rPr>
+              <w:b/>
+              <w:bCs/>
+              <w:color w:val="C9A227"/>
+              <w:sz w:val="22"/>
+              <w:szCs w:val="22"/>
+            </w:rPr>
+            <w:fldChar w:fldCharType="separate"/>
+          </w:r>
+          <w:r>
+            <w:rPr>
+              <w:b/>
+              <w:bCs/>
+              <w:noProof/>
+              <w:color w:val="C9A227"/>
+              <w:sz w:val="22"/>
+              <w:szCs w:val="22"/>
+            </w:rPr>
+            <w:t>1</w:t>
+          </w:r>
+          <w:r>
+            <w:rPr>
+              <w:b/>
+              <w:bCs/>
+              <w:color w:val="C9A227"/>
+              <w:sz w:val="22"/>
+              <w:szCs w:val="22"/>
+            </w:rPr>
+            <w:fldChar w:fldCharType="end"/>
+          </w:r>
+          <w:r>
+            <w:rPr>
+              <w:color w:val="4A4A4A"/>
+              <w:sz w:val="21"/>
+              <w:szCs w:val="21"/>
+            </w:rPr>
+            <w:t xml:space="preserve"> / </w:t>
+          </w:r>
+          <w:r>
+            <w:rPr>
+              <w:b/>
+              <w:bCs/>
+              <w:color w:val="C9A227"/>
+              <w:sz w:val="22"/>
+              <w:szCs w:val="22"/>
+            </w:rPr>
+            <w:fldChar w:fldCharType="begin"/>
+          </w:r>
+          <w:r>
+            <w:rPr>
+              <w:b/>
+              <w:bCs/>
+              <w:color w:val="C9A227"/>
+              <w:sz w:val="22"/>
+              <w:szCs w:val="22"/>
+            </w:rPr>
+            <w:instrText>NUMPAGES</w:instrText>
+          </w:r>
+          <w:r>
+            <w:rPr>
+              <w:b/>
+              <w:bCs/>
+              <w:color w:val="C9A227"/>
+              <w:sz w:val="22"/>
+              <w:szCs w:val="22"/>
+            </w:rPr>
+            <w:fldChar w:fldCharType="separate"/>
+          </w:r>
+          <w:r>
+            <w:rPr>
+              <w:b/>
+              <w:bCs/>
+              <w:noProof/>
+              <w:color w:val="C9A227"/>
+              <w:sz w:val="22"/>
+              <w:szCs w:val="22"/>
+            </w:rPr>
+            <w:t>1</w:t>
+          </w:r>
+          <w:r>
+            <w:rPr>
+              <w:b/>
+              <w:bCs/>
+              <w:color w:val="C9A227"/>
+              <w:sz w:val="22"/>
+              <w:szCs w:val="22"/>
+            </w:rPr>
+            <w:fldChar w:fldCharType="end"/>
+          </w:r>
+        </w:p>
+      </w:tc>
+    </w:tr>
+  </w:tbl>
 </w:ftr>
 </file>
 
@@ -2292,7 +2197,7 @@
 </file>
 
 <file path=word/header1.xml><?xml version="1.0" encoding="utf-8"?>
-<w:hdr xmlns:wpc="http://schemas.microsoft.com/office/word/2010/wordprocessingCanvas" xmlns:cx="http://schemas.microsoft.com/office/drawing/2014/chartex" xmlns:cx1="http://schemas.microsoft.com/office/drawing/2015/9/8/chartex" xmlns:cx2="http://schemas.microsoft.com/office/drawing/2015/10/21/chartex" xmlns:cx3="http://schemas.microsoft.com/office/drawing/2016/5/9/chartex" xmlns:cx4="http://schemas.microsoft.com/office/drawing/2016/5/10/chartex" xmlns:cx5="http://schemas.microsoft.com/office/drawing/2016/5/11/chartex" xmlns:cx6="http://schemas.microsoft.com/office/drawing/2016/5/12/chartex" xmlns:cx7="http://schemas.microsoft.com/office/drawing/2016/5/13/chartex" xmlns:cx8="http://schemas.microsoft.com/office/drawing/2016/5/14/chartex" xmlns:mc="http://schemas.openxmlformats.org/markup-compatibility/2006" xmlns:m="http://schemas.openxmlformats.org/officeDocument/2006/math" xmlns:aink="http://schemas.microsoft.com/office/drawing/2016/ink" xmlns:am3d="http://schemas.microsoft.com/office/drawing/2017/model3d" xmlns:oel="http://schemas.microsoft.com/office/2019/extlst" xmlns:r="http://schemas.openxmlformats.org/officeDocument/2006/relationships" xmlns:wp14="http://schemas.microsoft.com/office/word/2010/wordprocessingDrawing" xmlns:wp="http://schemas.openxmlformats.org/drawingml/2006/wordprocessingDrawing" xmlns:wpg="http://schemas.microsoft.com/office/word/2010/wordprocessingGroup" xmlns:wpi="http://schemas.microsoft.com/office/word/2010/wordprocessingInk" xmlns:wps="http://schemas.microsoft.com/office/word/2010/wordprocessingShape" xmlns:o="urn:schemas-microsoft-com:office:office" xmlns:v="urn:schemas-microsoft-com:vml" xmlns:w10="urn:schemas-microsoft-com:office:word" xmlns:w="http://schemas.openxmlformats.org/wordprocessingml/2006/main" xmlns:w14="http://schemas.microsoft.com/office/word/2010/wordml" xmlns:w15="http://schemas.microsoft.com/office/word/2012/wordml" xmlns:w16cex="http://schemas.microsoft.com/office/word/2018/wordml/cex" xmlns:w16cid="http://schemas.microsoft.com/office/word/2016/wordml/cid" xmlns:w16="http://schemas.microsoft.com/office/word/2018/wordml" xmlns:w16sdtdh="http://schemas.microsoft.com/office/word/2020/wordml/sdtdatahash" xmlns:w16sdtfl="http://schemas.microsoft.com/office/word/2024/wordml/sdtformatlock" xmlns:w16se="http://schemas.microsoft.com/office/word/2015/wordml/symex" xmlns:w16du="http://schemas.microsoft.com/office/word/2023/wordml/word16du" xmlns:wne="http://schemas.microsoft.com/office/word/2006/wordml" mc:Ignorable="w14 w15 w16se w16cid w16 w16cex w16sdtdh w16sdtfl w16du wp14">
+<w:hdr xmlns:m="http://schemas.openxmlformats.org/officeDocument/2006/math" xmlns:mc="http://schemas.openxmlformats.org/markup-compatibility/2006" xmlns:mo="http://schemas.microsoft.com/office/mac/office/2008/main" xmlns:mv="urn:schemas-microsoft-com:mac:vml" xmlns:o="urn:schemas-microsoft-com:office:office" xmlns:r="http://schemas.openxmlformats.org/officeDocument/2006/relationships" xmlns:v="urn:schemas-microsoft-com:vml" xmlns:w10="urn:schemas-microsoft-com:office:word" xmlns:w14="http://schemas.microsoft.com/office/word/2010/wordml" xmlns:w="http://schemas.openxmlformats.org/wordprocessingml/2006/main" xmlns:wne="http://schemas.microsoft.com/office/word/2006/wordml" xmlns:wp14="http://schemas.microsoft.com/office/word/2010/wordprocessingDrawing" xmlns:wp="http://schemas.openxmlformats.org/drawingml/2006/wordprocessingDrawing" xmlns:wpc="http://schemas.microsoft.com/office/word/2010/wordprocessingCanvas" xmlns:wpg="http://schemas.microsoft.com/office/word/2010/wordprocessingGroup" xmlns:wpi="http://schemas.microsoft.com/office/word/2010/wordprocessingInk" xmlns:wps="http://schemas.microsoft.com/office/word/2010/wordprocessingShape" mc:Ignorable="w14 wp14">
   <w:p>
     <w:pPr>
       <w:spacing w:line="20" w:lineRule="exact"/>
@@ -2328,7 +2233,7 @@
                   <pic:cNvPicPr/>
                 </pic:nvPicPr>
                 <pic:blipFill rotWithShape="1">
-                  <a:blip r:embed="rId1">
+                  <a:blip r:embed="rId2">
                     <a:extLst>
                       <a:ext uri="{28A0092B-C50C-407E-A947-70E740481C1C}">
                         <a14:useLocalDpi xmlns:a14="http://schemas.microsoft.com/office/drawing/2010/main" val="0"/>
@@ -2400,7 +2305,7 @@
                   </pic:cNvPicPr>
                 </pic:nvPicPr>
                 <pic:blipFill>
-                  <a:blip r:embed="rId1">
+                  <a:blip r:embed="rId2">
                     <a:extLst>
                       <a:ext uri="{28A0092B-C50C-407E-A947-70E740481C1C}">
                         <a14:useLocalDpi xmlns:a14="http://schemas.microsoft.com/office/drawing/2010/main" val="0"/>
@@ -2470,7 +2375,7 @@
                   <pic:cNvPicPr/>
                 </pic:nvPicPr>
                 <pic:blipFill rotWithShape="1">
-                  <a:blip r:embed="rId2">
+                  <a:blip r:embed="rId1">
                     <a:extLst>
                       <a:ext uri="{28A0092B-C50C-407E-A947-70E740481C1C}">
                         <a14:useLocalDpi xmlns:a14="http://schemas.microsoft.com/office/drawing/2010/main" val="0"/>
@@ -2542,7 +2447,7 @@
                   </pic:cNvPicPr>
                 </pic:nvPicPr>
                 <pic:blipFill>
-                  <a:blip r:embed="rId1">
+                  <a:blip r:embed="rId2">
                     <a:extLst>
                       <a:ext uri="{28A0092B-C50C-407E-A947-70E740481C1C}">
                         <a14:useLocalDpi xmlns:a14="http://schemas.microsoft.com/office/drawing/2010/main" val="0"/>

</xml_diff>